<commit_message>
docs: detail downstream accessibility of inbound event data in integration guide
</commit_message>
<xml_diff>
--- a/external-approval-integration-guide.docx
+++ b/external-approval-integration-guide.docx
@@ -2924,6 +2924,263 @@
         <w:rPr>
           <w:color w:val="2E75B6"/>
         </w:rPr>
+        <w:t>5.1 Downstream Accessibility of Inbound Event Data</w:t>
+      </w:r>
+    </w:p>
+    <w:p>
+      <w:pPr>
+        <w:spacing w:before="0" w:after="80"/>
+      </w:pPr>
+      <w:r>
+        <w:rPr>
+          <w:b/>
+        </w:rPr>
+        <w:t>YES! All data received in the inbound event payload is automatically saved into the runtime `context` and is 100% available to all downstream nodes in the workflow.</w:t>
+      </w:r>
+    </w:p>
+    <w:p>
+      <w:pPr>
+        <w:spacing w:before="0" w:after="80"/>
+      </w:pPr>
+      <w:r>
+        <w:t xml:space="preserve">When the inbound event arrives, </w:t>
+      </w:r>
+      <w:r>
+        <w:rPr>
+          <w:rFonts w:ascii="Consolas" w:hAnsi="Consolas"/>
+          <w:color w:val="C50F1F"/>
+          <w:sz w:val="19"/>
+        </w:rPr>
+        <w:t>ExecutionService.resume()</w:t>
+      </w:r>
+      <w:r>
+        <w:t xml:space="preserve"> passes the event payload to </w:t>
+      </w:r>
+      <w:r>
+        <w:rPr>
+          <w:rFonts w:ascii="Consolas" w:hAnsi="Consolas"/>
+          <w:color w:val="C50F1F"/>
+          <w:sz w:val="19"/>
+        </w:rPr>
+        <w:t>ResumeRouter.applyPayloadMapping()</w:t>
+      </w:r>
+      <w:r>
+        <w:t xml:space="preserve">, which merges the attributes into the workflow's shared execution </w:t>
+      </w:r>
+      <w:r>
+        <w:rPr>
+          <w:rFonts w:ascii="Consolas" w:hAnsi="Consolas"/>
+          <w:color w:val="C50F1F"/>
+          <w:sz w:val="19"/>
+        </w:rPr>
+        <w:t>context</w:t>
+      </w:r>
+      <w:r>
+        <w:t>.</w:t>
+      </w:r>
+    </w:p>
+    <w:p>
+      <w:pPr>
+        <w:pStyle w:val="Heading3"/>
+        <w:spacing w:before="200" w:after="40"/>
+      </w:pPr>
+      <w:r>
+        <w:rPr>
+          <w:color w:val="4472C4"/>
+        </w:rPr>
+        <w:t>Downstream Access Patterns:</w:t>
+      </w:r>
+    </w:p>
+    <w:p>
+      <w:pPr>
+        <w:spacing w:before="0" w:after="80"/>
+      </w:pPr>
+      <w:r>
+        <w:t xml:space="preserve">1. </w:t>
+      </w:r>
+      <w:r>
+        <w:rPr>
+          <w:b/>
+        </w:rPr>
+        <w:t>Downstream Decision &amp; Rule Nodes (SpEL Expressions)</w:t>
+      </w:r>
+      <w:r>
+        <w:t>:</w:t>
+      </w:r>
+    </w:p>
+    <w:p>
+      <w:pPr>
+        <w:spacing w:before="0" w:after="80"/>
+      </w:pPr>
+      <w:r>
+        <w:t>Downstream rules and edge conditions evaluate mapped or raw payload fields directly:</w:t>
+      </w:r>
+    </w:p>
+    <w:p>
+      <w:pPr>
+        <w:spacing w:before="80" w:after="160"/>
+        <w:ind w:left="432"/>
+      </w:pPr>
+      <w:r>
+        <w:rPr>
+          <w:rFonts w:ascii="Consolas" w:hAnsi="Consolas"/>
+          <w:color w:val="1E1E1E"/>
+          <w:sz w:val="19"/>
+        </w:rPr>
+        <w:t xml:space="preserve">   #context['appStatus'] == 'APPROVED'</w:t>
+        <w:br/>
+        <w:t xml:space="preserve">   #context['discountAmount'] &gt; 500</w:t>
+        <w:br/>
+        <w:t xml:space="preserve">   #context['approvedBy'] != null</w:t>
+      </w:r>
+    </w:p>
+    <w:p>
+      <w:pPr>
+        <w:spacing w:before="0" w:after="80"/>
+      </w:pPr>
+      <w:r>
+        <w:t xml:space="preserve">2. </w:t>
+      </w:r>
+      <w:r>
+        <w:rPr>
+          <w:b/>
+        </w:rPr>
+        <w:t>Downstream Command &amp; REST Nodes (`COMMAND` / `HTTP_REST`)</w:t>
+      </w:r>
+      <w:r>
+        <w:t>:</w:t>
+      </w:r>
+    </w:p>
+    <w:p>
+      <w:pPr>
+        <w:spacing w:before="0" w:after="80"/>
+      </w:pPr>
+      <w:r>
+        <w:t>Downstream system dispatches (such as updating CRM, calling provision APIs, or publishing Kafka notifications) reference inbound approval variables directly in their parameter templates:</w:t>
+      </w:r>
+    </w:p>
+    <w:p>
+      <w:pPr>
+        <w:spacing w:before="80" w:after="160"/>
+        <w:ind w:left="432"/>
+      </w:pPr>
+      <w:r>
+        <w:rPr>
+          <w:rFonts w:ascii="Consolas" w:hAnsi="Consolas"/>
+          <w:color w:val="1E1E1E"/>
+          <w:sz w:val="19"/>
+        </w:rPr>
+        <w:t xml:space="preserve">   {</w:t>
+        <w:br/>
+        <w:t xml:space="preserve">     "cafId": "#context['businessKey']",</w:t>
+        <w:br/>
+        <w:t xml:space="preserve">     "formStatus": "#context['appStatus']",</w:t>
+        <w:br/>
+        <w:t xml:space="preserve">     "approver": "#context['approvedBy']"</w:t>
+        <w:br/>
+        <w:t xml:space="preserve">   }</w:t>
+      </w:r>
+    </w:p>
+    <w:p>
+      <w:pPr>
+        <w:spacing w:before="0" w:after="80"/>
+      </w:pPr>
+      <w:r>
+        <w:t xml:space="preserve">3. </w:t>
+      </w:r>
+      <w:r>
+        <w:rPr>
+          <w:b/>
+        </w:rPr>
+        <w:t>Downstream Child Workflows &amp; Sub-Tasks (`SUB_WORKFLOW` / `BUCKET`)</w:t>
+      </w:r>
+      <w:r>
+        <w:t>:</w:t>
+      </w:r>
+    </w:p>
+    <w:p>
+      <w:pPr>
+        <w:spacing w:before="0" w:after="80"/>
+      </w:pPr>
+      <w:r>
+        <w:t>Subsequent buckets or child sub-workflows inherit the updated context map, passing approver names, timestamps, and notes to downstream task workers.</w:t>
+      </w:r>
+    </w:p>
+    <w:p>
+      <w:pPr>
+        <w:spacing w:before="0" w:after="80"/>
+      </w:pPr>
+      <w:r>
+        <w:t xml:space="preserve">4. </w:t>
+      </w:r>
+      <w:r>
+        <w:rPr>
+          <w:b/>
+        </w:rPr>
+        <w:t>Live Debugger &amp; Operational Audit Trail</w:t>
+      </w:r>
+      <w:r>
+        <w:t>:</w:t>
+      </w:r>
+    </w:p>
+    <w:p>
+      <w:pPr>
+        <w:spacing w:before="0" w:after="80"/>
+      </w:pPr>
+      <w:r>
+        <w:t xml:space="preserve">The inbound event payload is saved in </w:t>
+      </w:r>
+      <w:r>
+        <w:rPr>
+          <w:rFonts w:ascii="Consolas" w:hAnsi="Consolas"/>
+          <w:color w:val="C50F1F"/>
+          <w:sz w:val="19"/>
+        </w:rPr>
+        <w:t>TaskInstance.outputData</w:t>
+      </w:r>
+      <w:r>
+        <w:t xml:space="preserve"> and </w:t>
+      </w:r>
+      <w:r>
+        <w:rPr>
+          <w:rFonts w:ascii="Consolas" w:hAnsi="Consolas"/>
+          <w:color w:val="C50F1F"/>
+          <w:sz w:val="19"/>
+        </w:rPr>
+        <w:t>WorkflowInstance.serializedContext</w:t>
+      </w:r>
+      <w:r>
+        <w:t xml:space="preserve">, enabling visual inspection of callback data in </w:t>
+      </w:r>
+      <w:r>
+        <w:rPr>
+          <w:rFonts w:ascii="Consolas" w:hAnsi="Consolas"/>
+          <w:color w:val="C50F1F"/>
+          <w:sz w:val="19"/>
+        </w:rPr>
+        <w:t>atlas-ui</w:t>
+      </w:r>
+      <w:r>
+        <w:t>.</w:t>
+      </w:r>
+    </w:p>
+    <w:p>
+      <w:pPr>
+        <w:spacing w:before="0" w:after="80"/>
+      </w:pPr>
+      <w:r>
+        <w:t>---</w:t>
+      </w:r>
+    </w:p>
+    <w:p>
+      <w:pPr>
+        <w:pStyle w:val="Heading2"/>
+        <w:spacing w:before="280" w:after="80"/>
+      </w:pPr>
+      <w:r>
+        <w:rPr>
+          <w:color w:val="2E75B6"/>
+        </w:rPr>
         <w:t>6. Engine Spring Boot Configuration (</w:t>
       </w:r>
       <w:r>

</xml_diff>